<commit_message>
Documento: agregar el esquema relacional actualizado y quitar las menciones al script
</commit_message>
<xml_diff>
--- a/Documentación/Entrega 2/Entrega_2.docx
+++ b/Documentación/Entrega 2/Entrega_2.docx
@@ -1350,7 +1350,7 @@
           <w:szCs w:val="22"/>
         </w:rPr>
         <w:drawing>
-          <wp:inline distT="0" distB="0" distL="0" distR="0" wp14:anchorId="6C49C055" wp14:editId="35AC7CAE">
+          <wp:inline distT="0" distB="0" distL="0" distR="0" wp14:anchorId="65E606D0" wp14:editId="5960117E">
             <wp:extent cx="5341620" cy="15573375"/>
             <wp:effectExtent l="0" t="0" r="0" b="9525"/>
             <wp:docPr id="1" name="Imagen 1"/>
@@ -1475,6 +1475,1928 @@
     </w:p>
     <w:p>
       <w:pPr>
+        <w:pStyle w:val="Ttulo3"/>
+        <w:rPr>
+          <w:rFonts w:ascii="Calibri" w:eastAsia="Times New Roman" w:hAnsi="Calibri" w:cs="Calibri"/>
+        </w:rPr>
+      </w:pPr>
+      <w:r>
+        <w:rPr>
+          <w:rFonts w:ascii="Calibri" w:eastAsia="Times New Roman" w:hAnsi="Calibri" w:cs="Calibri"/>
+        </w:rPr>
+        <w:t>Esquema relacional actualizado</w:t>
+      </w:r>
+    </w:p>
+    <w:p>
+      <w:pPr>
+        <w:pStyle w:val="NormalWeb"/>
+        <w:rPr>
+          <w:rFonts w:ascii="Calibri" w:hAnsi="Calibri" w:cs="Calibri"/>
+          <w:color w:val="1F2937"/>
+          <w:sz w:val="22"/>
+          <w:szCs w:val="22"/>
+        </w:rPr>
+      </w:pPr>
+      <w:r>
+        <w:rPr>
+          <w:rFonts w:ascii="Calibri" w:hAnsi="Calibri" w:cs="Calibri"/>
+          <w:color w:val="1F2937"/>
+          <w:sz w:val="22"/>
+          <w:szCs w:val="22"/>
+        </w:rPr>
+        <w:t xml:space="preserve">Resultado del mapeo del diagrama. La clave primaria va </w:t>
+      </w:r>
+      <w:r>
+        <w:rPr>
+          <w:rFonts w:ascii="Calibri" w:hAnsi="Calibri" w:cs="Calibri"/>
+          <w:color w:val="1F2937"/>
+          <w:sz w:val="22"/>
+          <w:szCs w:val="22"/>
+          <w:u w:val="single"/>
+        </w:rPr>
+        <w:t>subrayada</w:t>
+      </w:r>
+      <w:r>
+        <w:rPr>
+          <w:rFonts w:ascii="Calibri" w:hAnsi="Calibri" w:cs="Calibri"/>
+          <w:color w:val="1F2937"/>
+          <w:sz w:val="22"/>
+          <w:szCs w:val="22"/>
+        </w:rPr>
+        <w:t xml:space="preserve">; las filas marcadas con </w:t>
+      </w:r>
+      <w:r>
+        <w:rPr>
+          <w:rFonts w:ascii="Segoe UI Symbol" w:hAnsi="Segoe UI Symbol" w:cs="Segoe UI Symbol"/>
+          <w:color w:val="1F2937"/>
+          <w:sz w:val="22"/>
+          <w:szCs w:val="22"/>
+        </w:rPr>
+        <w:t>★</w:t>
+      </w:r>
+      <w:r>
+        <w:rPr>
+          <w:rFonts w:ascii="Calibri" w:hAnsi="Calibri" w:cs="Calibri"/>
+          <w:color w:val="1F2937"/>
+          <w:sz w:val="22"/>
+          <w:szCs w:val="22"/>
+        </w:rPr>
+        <w:t xml:space="preserve"> son nuevas o cambiaron desde la Entrega 1.</w:t>
+      </w:r>
+    </w:p>
+    <w:tbl>
+      <w:tblPr>
+        <w:tblW w:w="5000" w:type="pct"/>
+        <w:tblCellMar>
+          <w:top w:w="15" w:type="dxa"/>
+          <w:left w:w="15" w:type="dxa"/>
+          <w:bottom w:w="15" w:type="dxa"/>
+          <w:right w:w="15" w:type="dxa"/>
+        </w:tblCellMar>
+        <w:tblLook w:val="04A0" w:firstRow="1" w:lastRow="0" w:firstColumn="1" w:lastColumn="0" w:noHBand="0" w:noVBand="1"/>
+      </w:tblPr>
+      <w:tblGrid>
+        <w:gridCol w:w="3986"/>
+        <w:gridCol w:w="2847"/>
+        <w:gridCol w:w="2657"/>
+      </w:tblGrid>
+      <w:tr>
+        <w:tc>
+          <w:tcPr>
+            <w:tcW w:w="2100" w:type="pct"/>
+            <w:tcBorders>
+              <w:top w:val="single" w:sz="6" w:space="0" w:color="334155"/>
+              <w:left w:val="single" w:sz="6" w:space="0" w:color="334155"/>
+              <w:bottom w:val="single" w:sz="6" w:space="0" w:color="334155"/>
+              <w:right w:val="single" w:sz="6" w:space="0" w:color="334155"/>
+            </w:tcBorders>
+            <w:shd w:val="clear" w:color="auto" w:fill="334155"/>
+            <w:tcMar>
+              <w:top w:w="60" w:type="dxa"/>
+              <w:left w:w="100" w:type="dxa"/>
+              <w:bottom w:w="60" w:type="dxa"/>
+              <w:right w:w="100" w:type="dxa"/>
+            </w:tcMar>
+            <w:vAlign w:val="center"/>
+            <w:hideMark/>
+          </w:tcPr>
+          <w:p>
+            <w:pPr>
+              <w:spacing w:before="120" w:after="120"/>
+              <w:rPr>
+                <w:rFonts w:ascii="Calibri" w:eastAsia="Times New Roman" w:hAnsi="Calibri" w:cs="Calibri"/>
+                <w:b/>
+                <w:bCs/>
+                <w:color w:val="FFFFFF"/>
+                <w:sz w:val="19"/>
+                <w:szCs w:val="19"/>
+              </w:rPr>
+            </w:pPr>
+            <w:r>
+              <w:rPr>
+                <w:rFonts w:ascii="Calibri" w:eastAsia="Times New Roman" w:hAnsi="Calibri" w:cs="Calibri"/>
+                <w:b/>
+                <w:bCs/>
+                <w:color w:val="FFFFFF"/>
+                <w:sz w:val="19"/>
+                <w:szCs w:val="19"/>
+              </w:rPr>
+              <w:t>Relación (atributos)</w:t>
+            </w:r>
+          </w:p>
+        </w:tc>
+        <w:tc>
+          <w:tcPr>
+            <w:tcW w:w="1500" w:type="pct"/>
+            <w:tcBorders>
+              <w:top w:val="single" w:sz="6" w:space="0" w:color="334155"/>
+              <w:left w:val="single" w:sz="6" w:space="0" w:color="334155"/>
+              <w:bottom w:val="single" w:sz="6" w:space="0" w:color="334155"/>
+              <w:right w:val="single" w:sz="6" w:space="0" w:color="334155"/>
+            </w:tcBorders>
+            <w:shd w:val="clear" w:color="auto" w:fill="334155"/>
+            <w:tcMar>
+              <w:top w:w="60" w:type="dxa"/>
+              <w:left w:w="100" w:type="dxa"/>
+              <w:bottom w:w="60" w:type="dxa"/>
+              <w:right w:w="100" w:type="dxa"/>
+            </w:tcMar>
+            <w:vAlign w:val="center"/>
+            <w:hideMark/>
+          </w:tcPr>
+          <w:p>
+            <w:pPr>
+              <w:spacing w:before="120" w:after="120"/>
+              <w:rPr>
+                <w:rFonts w:ascii="Calibri" w:eastAsia="Times New Roman" w:hAnsi="Calibri" w:cs="Calibri"/>
+                <w:b/>
+                <w:bCs/>
+                <w:color w:val="FFFFFF"/>
+                <w:sz w:val="19"/>
+                <w:szCs w:val="19"/>
+              </w:rPr>
+            </w:pPr>
+            <w:r>
+              <w:rPr>
+                <w:rFonts w:ascii="Calibri" w:eastAsia="Times New Roman" w:hAnsi="Calibri" w:cs="Calibri"/>
+                <w:b/>
+                <w:bCs/>
+                <w:color w:val="FFFFFF"/>
+                <w:sz w:val="19"/>
+                <w:szCs w:val="19"/>
+              </w:rPr>
+              <w:t>Claves foráneas</w:t>
+            </w:r>
+          </w:p>
+        </w:tc>
+        <w:tc>
+          <w:tcPr>
+            <w:tcW w:w="0" w:type="auto"/>
+            <w:tcBorders>
+              <w:top w:val="single" w:sz="6" w:space="0" w:color="334155"/>
+              <w:left w:val="single" w:sz="6" w:space="0" w:color="334155"/>
+              <w:bottom w:val="single" w:sz="6" w:space="0" w:color="334155"/>
+              <w:right w:val="single" w:sz="6" w:space="0" w:color="334155"/>
+            </w:tcBorders>
+            <w:shd w:val="clear" w:color="auto" w:fill="334155"/>
+            <w:tcMar>
+              <w:top w:w="60" w:type="dxa"/>
+              <w:left w:w="100" w:type="dxa"/>
+              <w:bottom w:w="60" w:type="dxa"/>
+              <w:right w:w="100" w:type="dxa"/>
+            </w:tcMar>
+            <w:vAlign w:val="center"/>
+            <w:hideMark/>
+          </w:tcPr>
+          <w:p>
+            <w:pPr>
+              <w:spacing w:before="120" w:after="120"/>
+              <w:rPr>
+                <w:rFonts w:ascii="Calibri" w:eastAsia="Times New Roman" w:hAnsi="Calibri" w:cs="Calibri"/>
+                <w:b/>
+                <w:bCs/>
+                <w:color w:val="FFFFFF"/>
+                <w:sz w:val="19"/>
+                <w:szCs w:val="19"/>
+              </w:rPr>
+            </w:pPr>
+            <w:r>
+              <w:rPr>
+                <w:rFonts w:ascii="Calibri" w:eastAsia="Times New Roman" w:hAnsi="Calibri" w:cs="Calibri"/>
+                <w:b/>
+                <w:bCs/>
+                <w:color w:val="FFFFFF"/>
+                <w:sz w:val="19"/>
+                <w:szCs w:val="19"/>
+              </w:rPr>
+              <w:t>Política de borrado</w:t>
+            </w:r>
+          </w:p>
+        </w:tc>
+      </w:tr>
+      <w:tr>
+        <w:tc>
+          <w:tcPr>
+            <w:tcW w:w="0" w:type="auto"/>
+            <w:tcBorders>
+              <w:top w:val="single" w:sz="6" w:space="0" w:color="CBD5E1"/>
+              <w:left w:val="single" w:sz="6" w:space="0" w:color="CBD5E1"/>
+              <w:bottom w:val="single" w:sz="6" w:space="0" w:color="CBD5E1"/>
+              <w:right w:val="single" w:sz="6" w:space="0" w:color="CBD5E1"/>
+            </w:tcBorders>
+            <w:tcMar>
+              <w:top w:w="60" w:type="dxa"/>
+              <w:left w:w="100" w:type="dxa"/>
+              <w:bottom w:w="60" w:type="dxa"/>
+              <w:right w:w="100" w:type="dxa"/>
+            </w:tcMar>
+            <w:hideMark/>
+          </w:tcPr>
+          <w:p>
+            <w:pPr>
+              <w:spacing w:before="120" w:after="120"/>
+              <w:rPr>
+                <w:rFonts w:ascii="Calibri" w:eastAsia="Times New Roman" w:hAnsi="Calibri" w:cs="Calibri"/>
+                <w:color w:val="1F2937"/>
+                <w:sz w:val="19"/>
+                <w:szCs w:val="19"/>
+              </w:rPr>
+            </w:pPr>
+            <w:r>
+              <w:rPr>
+                <w:rFonts w:ascii="Calibri" w:eastAsia="Times New Roman" w:hAnsi="Calibri" w:cs="Calibri"/>
+                <w:color w:val="1F2937"/>
+                <w:sz w:val="19"/>
+                <w:szCs w:val="19"/>
+              </w:rPr>
+              <w:t>autores(</w:t>
+            </w:r>
+            <w:r>
+              <w:rPr>
+                <w:rFonts w:ascii="Calibri" w:eastAsia="Times New Roman" w:hAnsi="Calibri" w:cs="Calibri"/>
+                <w:color w:val="1F2937"/>
+                <w:sz w:val="19"/>
+                <w:szCs w:val="19"/>
+                <w:u w:val="single"/>
+              </w:rPr>
+              <w:t>id_autor</w:t>
+            </w:r>
+            <w:r>
+              <w:rPr>
+                <w:rFonts w:ascii="Calibri" w:eastAsia="Times New Roman" w:hAnsi="Calibri" w:cs="Calibri"/>
+                <w:color w:val="1F2937"/>
+                <w:sz w:val="19"/>
+                <w:szCs w:val="19"/>
+              </w:rPr>
+              <w:t>, nombre, nacionalidad)</w:t>
+            </w:r>
+          </w:p>
+        </w:tc>
+        <w:tc>
+          <w:tcPr>
+            <w:tcW w:w="0" w:type="auto"/>
+            <w:tcBorders>
+              <w:top w:val="single" w:sz="6" w:space="0" w:color="CBD5E1"/>
+              <w:left w:val="single" w:sz="6" w:space="0" w:color="CBD5E1"/>
+              <w:bottom w:val="single" w:sz="6" w:space="0" w:color="CBD5E1"/>
+              <w:right w:val="single" w:sz="6" w:space="0" w:color="CBD5E1"/>
+            </w:tcBorders>
+            <w:tcMar>
+              <w:top w:w="60" w:type="dxa"/>
+              <w:left w:w="100" w:type="dxa"/>
+              <w:bottom w:w="60" w:type="dxa"/>
+              <w:right w:w="100" w:type="dxa"/>
+            </w:tcMar>
+            <w:hideMark/>
+          </w:tcPr>
+          <w:p>
+            <w:pPr>
+              <w:spacing w:before="120" w:after="120"/>
+              <w:rPr>
+                <w:rFonts w:ascii="Calibri" w:eastAsia="Times New Roman" w:hAnsi="Calibri" w:cs="Calibri"/>
+                <w:color w:val="1F2937"/>
+                <w:sz w:val="19"/>
+                <w:szCs w:val="19"/>
+              </w:rPr>
+            </w:pPr>
+            <w:r>
+              <w:rPr>
+                <w:rFonts w:ascii="Calibri" w:eastAsia="Times New Roman" w:hAnsi="Calibri" w:cs="Calibri"/>
+                <w:color w:val="1F2937"/>
+                <w:sz w:val="19"/>
+                <w:szCs w:val="19"/>
+              </w:rPr>
+              <w:t>—</w:t>
+            </w:r>
+          </w:p>
+        </w:tc>
+        <w:tc>
+          <w:tcPr>
+            <w:tcW w:w="0" w:type="auto"/>
+            <w:tcBorders>
+              <w:top w:val="single" w:sz="6" w:space="0" w:color="CBD5E1"/>
+              <w:left w:val="single" w:sz="6" w:space="0" w:color="CBD5E1"/>
+              <w:bottom w:val="single" w:sz="6" w:space="0" w:color="CBD5E1"/>
+              <w:right w:val="single" w:sz="6" w:space="0" w:color="CBD5E1"/>
+            </w:tcBorders>
+            <w:tcMar>
+              <w:top w:w="60" w:type="dxa"/>
+              <w:left w:w="100" w:type="dxa"/>
+              <w:bottom w:w="60" w:type="dxa"/>
+              <w:right w:w="100" w:type="dxa"/>
+            </w:tcMar>
+            <w:hideMark/>
+          </w:tcPr>
+          <w:p>
+            <w:pPr>
+              <w:spacing w:before="120" w:after="120"/>
+              <w:rPr>
+                <w:rFonts w:ascii="Calibri" w:eastAsia="Times New Roman" w:hAnsi="Calibri" w:cs="Calibri"/>
+                <w:color w:val="1F2937"/>
+                <w:sz w:val="19"/>
+                <w:szCs w:val="19"/>
+              </w:rPr>
+            </w:pPr>
+            <w:r>
+              <w:rPr>
+                <w:rFonts w:ascii="Calibri" w:eastAsia="Times New Roman" w:hAnsi="Calibri" w:cs="Calibri"/>
+                <w:color w:val="1F2937"/>
+                <w:sz w:val="19"/>
+                <w:szCs w:val="19"/>
+              </w:rPr>
+              <w:t>—</w:t>
+            </w:r>
+          </w:p>
+        </w:tc>
+      </w:tr>
+      <w:tr>
+        <w:tc>
+          <w:tcPr>
+            <w:tcW w:w="0" w:type="auto"/>
+            <w:tcBorders>
+              <w:top w:val="single" w:sz="6" w:space="0" w:color="CBD5E1"/>
+              <w:left w:val="single" w:sz="6" w:space="0" w:color="CBD5E1"/>
+              <w:bottom w:val="single" w:sz="6" w:space="0" w:color="CBD5E1"/>
+              <w:right w:val="single" w:sz="6" w:space="0" w:color="CBD5E1"/>
+            </w:tcBorders>
+            <w:tcMar>
+              <w:top w:w="60" w:type="dxa"/>
+              <w:left w:w="100" w:type="dxa"/>
+              <w:bottom w:w="60" w:type="dxa"/>
+              <w:right w:w="100" w:type="dxa"/>
+            </w:tcMar>
+            <w:hideMark/>
+          </w:tcPr>
+          <w:p>
+            <w:pPr>
+              <w:spacing w:before="120" w:after="120"/>
+              <w:rPr>
+                <w:rFonts w:ascii="Calibri" w:eastAsia="Times New Roman" w:hAnsi="Calibri" w:cs="Calibri"/>
+                <w:color w:val="1F2937"/>
+                <w:sz w:val="19"/>
+                <w:szCs w:val="19"/>
+              </w:rPr>
+            </w:pPr>
+            <w:r>
+              <w:rPr>
+                <w:rFonts w:ascii="Calibri" w:eastAsia="Times New Roman" w:hAnsi="Calibri" w:cs="Calibri"/>
+                <w:color w:val="1F2937"/>
+                <w:sz w:val="19"/>
+                <w:szCs w:val="19"/>
+              </w:rPr>
+              <w:t>libros(</w:t>
+            </w:r>
+            <w:r>
+              <w:rPr>
+                <w:rFonts w:ascii="Calibri" w:eastAsia="Times New Roman" w:hAnsi="Calibri" w:cs="Calibri"/>
+                <w:color w:val="1F2937"/>
+                <w:sz w:val="19"/>
+                <w:szCs w:val="19"/>
+                <w:u w:val="single"/>
+              </w:rPr>
+              <w:t>id_libro</w:t>
+            </w:r>
+            <w:r>
+              <w:rPr>
+                <w:rFonts w:ascii="Calibri" w:eastAsia="Times New Roman" w:hAnsi="Calibri" w:cs="Calibri"/>
+                <w:color w:val="1F2937"/>
+                <w:sz w:val="19"/>
+                <w:szCs w:val="19"/>
+              </w:rPr>
+              <w:t xml:space="preserve">, id_autor_principal, titulo, genero, editorial, anio_publicacion) </w:t>
+            </w:r>
+            <w:r>
+              <w:rPr>
+                <w:rFonts w:ascii="Segoe UI Symbol" w:eastAsia="Times New Roman" w:hAnsi="Segoe UI Symbol" w:cs="Segoe UI Symbol"/>
+                <w:color w:val="1F2937"/>
+                <w:sz w:val="19"/>
+                <w:szCs w:val="19"/>
+              </w:rPr>
+              <w:t>★</w:t>
+            </w:r>
+          </w:p>
+        </w:tc>
+        <w:tc>
+          <w:tcPr>
+            <w:tcW w:w="0" w:type="auto"/>
+            <w:tcBorders>
+              <w:top w:val="single" w:sz="6" w:space="0" w:color="CBD5E1"/>
+              <w:left w:val="single" w:sz="6" w:space="0" w:color="CBD5E1"/>
+              <w:bottom w:val="single" w:sz="6" w:space="0" w:color="CBD5E1"/>
+              <w:right w:val="single" w:sz="6" w:space="0" w:color="CBD5E1"/>
+            </w:tcBorders>
+            <w:tcMar>
+              <w:top w:w="60" w:type="dxa"/>
+              <w:left w:w="100" w:type="dxa"/>
+              <w:bottom w:w="60" w:type="dxa"/>
+              <w:right w:w="100" w:type="dxa"/>
+            </w:tcMar>
+            <w:hideMark/>
+          </w:tcPr>
+          <w:p>
+            <w:pPr>
+              <w:spacing w:before="120" w:after="120"/>
+              <w:rPr>
+                <w:rFonts w:ascii="Calibri" w:eastAsia="Times New Roman" w:hAnsi="Calibri" w:cs="Calibri"/>
+                <w:color w:val="1F2937"/>
+                <w:sz w:val="19"/>
+                <w:szCs w:val="19"/>
+              </w:rPr>
+            </w:pPr>
+            <w:r>
+              <w:rPr>
+                <w:rFonts w:ascii="Calibri" w:eastAsia="Times New Roman" w:hAnsi="Calibri" w:cs="Calibri"/>
+                <w:color w:val="1F2937"/>
+                <w:sz w:val="19"/>
+                <w:szCs w:val="19"/>
+              </w:rPr>
+              <w:t>id_autor_principal → autores</w:t>
+            </w:r>
+          </w:p>
+        </w:tc>
+        <w:tc>
+          <w:tcPr>
+            <w:tcW w:w="0" w:type="auto"/>
+            <w:tcBorders>
+              <w:top w:val="single" w:sz="6" w:space="0" w:color="CBD5E1"/>
+              <w:left w:val="single" w:sz="6" w:space="0" w:color="CBD5E1"/>
+              <w:bottom w:val="single" w:sz="6" w:space="0" w:color="CBD5E1"/>
+              <w:right w:val="single" w:sz="6" w:space="0" w:color="CBD5E1"/>
+            </w:tcBorders>
+            <w:tcMar>
+              <w:top w:w="60" w:type="dxa"/>
+              <w:left w:w="100" w:type="dxa"/>
+              <w:bottom w:w="60" w:type="dxa"/>
+              <w:right w:w="100" w:type="dxa"/>
+            </w:tcMar>
+            <w:hideMark/>
+          </w:tcPr>
+          <w:p>
+            <w:pPr>
+              <w:spacing w:before="120" w:after="120"/>
+              <w:rPr>
+                <w:rFonts w:ascii="Calibri" w:eastAsia="Times New Roman" w:hAnsi="Calibri" w:cs="Calibri"/>
+                <w:color w:val="1F2937"/>
+                <w:sz w:val="19"/>
+                <w:szCs w:val="19"/>
+              </w:rPr>
+            </w:pPr>
+            <w:r>
+              <w:rPr>
+                <w:rFonts w:ascii="Calibri" w:eastAsia="Times New Roman" w:hAnsi="Calibri" w:cs="Calibri"/>
+                <w:color w:val="1F2937"/>
+                <w:sz w:val="19"/>
+                <w:szCs w:val="19"/>
+              </w:rPr>
+              <w:t>RESTRICT: no se borra un autor que es autor principal de libros</w:t>
+            </w:r>
+          </w:p>
+        </w:tc>
+      </w:tr>
+      <w:tr>
+        <w:tc>
+          <w:tcPr>
+            <w:tcW w:w="0" w:type="auto"/>
+            <w:tcBorders>
+              <w:top w:val="single" w:sz="6" w:space="0" w:color="CBD5E1"/>
+              <w:left w:val="single" w:sz="6" w:space="0" w:color="CBD5E1"/>
+              <w:bottom w:val="single" w:sz="6" w:space="0" w:color="CBD5E1"/>
+              <w:right w:val="single" w:sz="6" w:space="0" w:color="CBD5E1"/>
+            </w:tcBorders>
+            <w:tcMar>
+              <w:top w:w="60" w:type="dxa"/>
+              <w:left w:w="100" w:type="dxa"/>
+              <w:bottom w:w="60" w:type="dxa"/>
+              <w:right w:w="100" w:type="dxa"/>
+            </w:tcMar>
+            <w:hideMark/>
+          </w:tcPr>
+          <w:p>
+            <w:pPr>
+              <w:spacing w:before="120" w:after="120"/>
+              <w:rPr>
+                <w:rFonts w:ascii="Calibri" w:eastAsia="Times New Roman" w:hAnsi="Calibri" w:cs="Calibri"/>
+                <w:color w:val="1F2937"/>
+                <w:sz w:val="19"/>
+                <w:szCs w:val="19"/>
+              </w:rPr>
+            </w:pPr>
+            <w:r>
+              <w:rPr>
+                <w:rFonts w:ascii="Calibri" w:eastAsia="Times New Roman" w:hAnsi="Calibri" w:cs="Calibri"/>
+                <w:color w:val="1F2937"/>
+                <w:sz w:val="19"/>
+                <w:szCs w:val="19"/>
+              </w:rPr>
+              <w:t>libro_coautores(</w:t>
+            </w:r>
+            <w:r>
+              <w:rPr>
+                <w:rFonts w:ascii="Calibri" w:eastAsia="Times New Roman" w:hAnsi="Calibri" w:cs="Calibri"/>
+                <w:color w:val="1F2937"/>
+                <w:sz w:val="19"/>
+                <w:szCs w:val="19"/>
+                <w:u w:val="single"/>
+              </w:rPr>
+              <w:t>id_libro, id_autor</w:t>
+            </w:r>
+            <w:r>
+              <w:rPr>
+                <w:rFonts w:ascii="Calibri" w:eastAsia="Times New Roman" w:hAnsi="Calibri" w:cs="Calibri"/>
+                <w:color w:val="1F2937"/>
+                <w:sz w:val="19"/>
+                <w:szCs w:val="19"/>
+              </w:rPr>
+              <w:t xml:space="preserve">, orden) </w:t>
+            </w:r>
+            <w:r>
+              <w:rPr>
+                <w:rFonts w:ascii="Segoe UI Symbol" w:eastAsia="Times New Roman" w:hAnsi="Segoe UI Symbol" w:cs="Segoe UI Symbol"/>
+                <w:color w:val="1F2937"/>
+                <w:sz w:val="19"/>
+                <w:szCs w:val="19"/>
+              </w:rPr>
+              <w:t>★</w:t>
+            </w:r>
+            <w:r>
+              <w:rPr>
+                <w:rFonts w:ascii="Calibri" w:eastAsia="Times New Roman" w:hAnsi="Calibri" w:cs="Calibri"/>
+                <w:color w:val="1F2937"/>
+                <w:sz w:val="19"/>
+                <w:szCs w:val="19"/>
+              </w:rPr>
+              <w:t xml:space="preserve"> nueva</w:t>
+            </w:r>
+          </w:p>
+        </w:tc>
+        <w:tc>
+          <w:tcPr>
+            <w:tcW w:w="0" w:type="auto"/>
+            <w:tcBorders>
+              <w:top w:val="single" w:sz="6" w:space="0" w:color="CBD5E1"/>
+              <w:left w:val="single" w:sz="6" w:space="0" w:color="CBD5E1"/>
+              <w:bottom w:val="single" w:sz="6" w:space="0" w:color="CBD5E1"/>
+              <w:right w:val="single" w:sz="6" w:space="0" w:color="CBD5E1"/>
+            </w:tcBorders>
+            <w:tcMar>
+              <w:top w:w="60" w:type="dxa"/>
+              <w:left w:w="100" w:type="dxa"/>
+              <w:bottom w:w="60" w:type="dxa"/>
+              <w:right w:w="100" w:type="dxa"/>
+            </w:tcMar>
+            <w:hideMark/>
+          </w:tcPr>
+          <w:p>
+            <w:pPr>
+              <w:spacing w:before="120" w:after="120"/>
+              <w:rPr>
+                <w:rFonts w:ascii="Calibri" w:eastAsia="Times New Roman" w:hAnsi="Calibri" w:cs="Calibri"/>
+                <w:color w:val="1F2937"/>
+                <w:sz w:val="19"/>
+                <w:szCs w:val="19"/>
+              </w:rPr>
+            </w:pPr>
+            <w:r>
+              <w:rPr>
+                <w:rFonts w:ascii="Calibri" w:eastAsia="Times New Roman" w:hAnsi="Calibri" w:cs="Calibri"/>
+                <w:color w:val="1F2937"/>
+                <w:sz w:val="19"/>
+                <w:szCs w:val="19"/>
+              </w:rPr>
+              <w:t>id_libro → libros</w:t>
+            </w:r>
+            <w:r>
+              <w:rPr>
+                <w:rFonts w:ascii="Calibri" w:eastAsia="Times New Roman" w:hAnsi="Calibri" w:cs="Calibri"/>
+                <w:color w:val="1F2937"/>
+                <w:sz w:val="19"/>
+                <w:szCs w:val="19"/>
+              </w:rPr>
+              <w:br/>
+              <w:t>id_autor → autores</w:t>
+            </w:r>
+          </w:p>
+        </w:tc>
+        <w:tc>
+          <w:tcPr>
+            <w:tcW w:w="0" w:type="auto"/>
+            <w:tcBorders>
+              <w:top w:val="single" w:sz="6" w:space="0" w:color="CBD5E1"/>
+              <w:left w:val="single" w:sz="6" w:space="0" w:color="CBD5E1"/>
+              <w:bottom w:val="single" w:sz="6" w:space="0" w:color="CBD5E1"/>
+              <w:right w:val="single" w:sz="6" w:space="0" w:color="CBD5E1"/>
+            </w:tcBorders>
+            <w:tcMar>
+              <w:top w:w="60" w:type="dxa"/>
+              <w:left w:w="100" w:type="dxa"/>
+              <w:bottom w:w="60" w:type="dxa"/>
+              <w:right w:w="100" w:type="dxa"/>
+            </w:tcMar>
+            <w:hideMark/>
+          </w:tcPr>
+          <w:p>
+            <w:pPr>
+              <w:spacing w:before="120" w:after="120"/>
+              <w:rPr>
+                <w:rFonts w:ascii="Calibri" w:eastAsia="Times New Roman" w:hAnsi="Calibri" w:cs="Calibri"/>
+                <w:color w:val="1F2937"/>
+                <w:sz w:val="19"/>
+                <w:szCs w:val="19"/>
+              </w:rPr>
+            </w:pPr>
+            <w:r>
+              <w:rPr>
+                <w:rFonts w:ascii="Calibri" w:eastAsia="Times New Roman" w:hAnsi="Calibri" w:cs="Calibri"/>
+                <w:color w:val="1F2937"/>
+                <w:sz w:val="19"/>
+                <w:szCs w:val="19"/>
+              </w:rPr>
+              <w:t>CASCADE si se borra el libro</w:t>
+            </w:r>
+            <w:r>
+              <w:rPr>
+                <w:rFonts w:ascii="Calibri" w:eastAsia="Times New Roman" w:hAnsi="Calibri" w:cs="Calibri"/>
+                <w:color w:val="1F2937"/>
+                <w:sz w:val="19"/>
+                <w:szCs w:val="19"/>
+              </w:rPr>
+              <w:br/>
+              <w:t>RESTRICT si se borra el autor</w:t>
+            </w:r>
+          </w:p>
+        </w:tc>
+      </w:tr>
+      <w:tr>
+        <w:tc>
+          <w:tcPr>
+            <w:tcW w:w="0" w:type="auto"/>
+            <w:tcBorders>
+              <w:top w:val="single" w:sz="6" w:space="0" w:color="CBD5E1"/>
+              <w:left w:val="single" w:sz="6" w:space="0" w:color="CBD5E1"/>
+              <w:bottom w:val="single" w:sz="6" w:space="0" w:color="CBD5E1"/>
+              <w:right w:val="single" w:sz="6" w:space="0" w:color="CBD5E1"/>
+            </w:tcBorders>
+            <w:tcMar>
+              <w:top w:w="60" w:type="dxa"/>
+              <w:left w:w="100" w:type="dxa"/>
+              <w:bottom w:w="60" w:type="dxa"/>
+              <w:right w:w="100" w:type="dxa"/>
+            </w:tcMar>
+            <w:hideMark/>
+          </w:tcPr>
+          <w:p>
+            <w:pPr>
+              <w:spacing w:before="120" w:after="120"/>
+              <w:rPr>
+                <w:rFonts w:ascii="Calibri" w:eastAsia="Times New Roman" w:hAnsi="Calibri" w:cs="Calibri"/>
+                <w:color w:val="1F2937"/>
+                <w:sz w:val="19"/>
+                <w:szCs w:val="19"/>
+              </w:rPr>
+            </w:pPr>
+            <w:r>
+              <w:rPr>
+                <w:rFonts w:ascii="Calibri" w:eastAsia="Times New Roman" w:hAnsi="Calibri" w:cs="Calibri"/>
+                <w:color w:val="1F2937"/>
+                <w:sz w:val="19"/>
+                <w:szCs w:val="19"/>
+              </w:rPr>
+              <w:t>ejemplares(</w:t>
+            </w:r>
+            <w:r>
+              <w:rPr>
+                <w:rFonts w:ascii="Calibri" w:eastAsia="Times New Roman" w:hAnsi="Calibri" w:cs="Calibri"/>
+                <w:color w:val="1F2937"/>
+                <w:sz w:val="19"/>
+                <w:szCs w:val="19"/>
+                <w:u w:val="single"/>
+              </w:rPr>
+              <w:t>id_libro, num_ejemplar</w:t>
+            </w:r>
+            <w:r>
+              <w:rPr>
+                <w:rFonts w:ascii="Calibri" w:eastAsia="Times New Roman" w:hAnsi="Calibri" w:cs="Calibri"/>
+                <w:color w:val="1F2937"/>
+                <w:sz w:val="19"/>
+                <w:szCs w:val="19"/>
+              </w:rPr>
+              <w:t>, estado)</w:t>
+            </w:r>
+          </w:p>
+        </w:tc>
+        <w:tc>
+          <w:tcPr>
+            <w:tcW w:w="0" w:type="auto"/>
+            <w:tcBorders>
+              <w:top w:val="single" w:sz="6" w:space="0" w:color="CBD5E1"/>
+              <w:left w:val="single" w:sz="6" w:space="0" w:color="CBD5E1"/>
+              <w:bottom w:val="single" w:sz="6" w:space="0" w:color="CBD5E1"/>
+              <w:right w:val="single" w:sz="6" w:space="0" w:color="CBD5E1"/>
+            </w:tcBorders>
+            <w:tcMar>
+              <w:top w:w="60" w:type="dxa"/>
+              <w:left w:w="100" w:type="dxa"/>
+              <w:bottom w:w="60" w:type="dxa"/>
+              <w:right w:w="100" w:type="dxa"/>
+            </w:tcMar>
+            <w:hideMark/>
+          </w:tcPr>
+          <w:p>
+            <w:pPr>
+              <w:spacing w:before="120" w:after="120"/>
+              <w:rPr>
+                <w:rFonts w:ascii="Calibri" w:eastAsia="Times New Roman" w:hAnsi="Calibri" w:cs="Calibri"/>
+                <w:color w:val="1F2937"/>
+                <w:sz w:val="19"/>
+                <w:szCs w:val="19"/>
+              </w:rPr>
+            </w:pPr>
+            <w:r>
+              <w:rPr>
+                <w:rFonts w:ascii="Calibri" w:eastAsia="Times New Roman" w:hAnsi="Calibri" w:cs="Calibri"/>
+                <w:color w:val="1F2937"/>
+                <w:sz w:val="19"/>
+                <w:szCs w:val="19"/>
+              </w:rPr>
+              <w:t>id_libro → libros</w:t>
+            </w:r>
+          </w:p>
+        </w:tc>
+        <w:tc>
+          <w:tcPr>
+            <w:tcW w:w="0" w:type="auto"/>
+            <w:tcBorders>
+              <w:top w:val="single" w:sz="6" w:space="0" w:color="CBD5E1"/>
+              <w:left w:val="single" w:sz="6" w:space="0" w:color="CBD5E1"/>
+              <w:bottom w:val="single" w:sz="6" w:space="0" w:color="CBD5E1"/>
+              <w:right w:val="single" w:sz="6" w:space="0" w:color="CBD5E1"/>
+            </w:tcBorders>
+            <w:tcMar>
+              <w:top w:w="60" w:type="dxa"/>
+              <w:left w:w="100" w:type="dxa"/>
+              <w:bottom w:w="60" w:type="dxa"/>
+              <w:right w:w="100" w:type="dxa"/>
+            </w:tcMar>
+            <w:hideMark/>
+          </w:tcPr>
+          <w:p>
+            <w:pPr>
+              <w:spacing w:before="120" w:after="120"/>
+              <w:rPr>
+                <w:rFonts w:ascii="Calibri" w:eastAsia="Times New Roman" w:hAnsi="Calibri" w:cs="Calibri"/>
+                <w:color w:val="1F2937"/>
+                <w:sz w:val="19"/>
+                <w:szCs w:val="19"/>
+              </w:rPr>
+            </w:pPr>
+            <w:r>
+              <w:rPr>
+                <w:rFonts w:ascii="Calibri" w:eastAsia="Times New Roman" w:hAnsi="Calibri" w:cs="Calibri"/>
+                <w:color w:val="1F2937"/>
+                <w:sz w:val="19"/>
+                <w:szCs w:val="19"/>
+              </w:rPr>
+              <w:t>CASCADE: entidad débil</w:t>
+            </w:r>
+          </w:p>
+        </w:tc>
+      </w:tr>
+      <w:tr>
+        <w:tc>
+          <w:tcPr>
+            <w:tcW w:w="0" w:type="auto"/>
+            <w:tcBorders>
+              <w:top w:val="single" w:sz="6" w:space="0" w:color="CBD5E1"/>
+              <w:left w:val="single" w:sz="6" w:space="0" w:color="CBD5E1"/>
+              <w:bottom w:val="single" w:sz="6" w:space="0" w:color="CBD5E1"/>
+              <w:right w:val="single" w:sz="6" w:space="0" w:color="CBD5E1"/>
+            </w:tcBorders>
+            <w:tcMar>
+              <w:top w:w="60" w:type="dxa"/>
+              <w:left w:w="100" w:type="dxa"/>
+              <w:bottom w:w="60" w:type="dxa"/>
+              <w:right w:w="100" w:type="dxa"/>
+            </w:tcMar>
+            <w:hideMark/>
+          </w:tcPr>
+          <w:p>
+            <w:pPr>
+              <w:spacing w:before="120" w:after="120"/>
+              <w:rPr>
+                <w:rFonts w:ascii="Calibri" w:eastAsia="Times New Roman" w:hAnsi="Calibri" w:cs="Calibri"/>
+                <w:color w:val="1F2937"/>
+                <w:sz w:val="19"/>
+                <w:szCs w:val="19"/>
+              </w:rPr>
+            </w:pPr>
+            <w:r>
+              <w:rPr>
+                <w:rFonts w:ascii="Calibri" w:eastAsia="Times New Roman" w:hAnsi="Calibri" w:cs="Calibri"/>
+                <w:color w:val="1F2937"/>
+                <w:sz w:val="19"/>
+                <w:szCs w:val="19"/>
+              </w:rPr>
+              <w:t>socios(</w:t>
+            </w:r>
+            <w:r>
+              <w:rPr>
+                <w:rFonts w:ascii="Calibri" w:eastAsia="Times New Roman" w:hAnsi="Calibri" w:cs="Calibri"/>
+                <w:color w:val="1F2937"/>
+                <w:sz w:val="19"/>
+                <w:szCs w:val="19"/>
+                <w:u w:val="single"/>
+              </w:rPr>
+              <w:t>id_socio</w:t>
+            </w:r>
+            <w:r>
+              <w:rPr>
+                <w:rFonts w:ascii="Calibri" w:eastAsia="Times New Roman" w:hAnsi="Calibri" w:cs="Calibri"/>
+                <w:color w:val="1F2937"/>
+                <w:sz w:val="19"/>
+                <w:szCs w:val="19"/>
+              </w:rPr>
+              <w:t xml:space="preserve">, nombre, tipo_socio, codigo_institucional) </w:t>
+            </w:r>
+            <w:r>
+              <w:rPr>
+                <w:rFonts w:ascii="Segoe UI Symbol" w:eastAsia="Times New Roman" w:hAnsi="Segoe UI Symbol" w:cs="Segoe UI Symbol"/>
+                <w:color w:val="1F2937"/>
+                <w:sz w:val="19"/>
+                <w:szCs w:val="19"/>
+              </w:rPr>
+              <w:t>★</w:t>
+            </w:r>
+          </w:p>
+        </w:tc>
+        <w:tc>
+          <w:tcPr>
+            <w:tcW w:w="0" w:type="auto"/>
+            <w:tcBorders>
+              <w:top w:val="single" w:sz="6" w:space="0" w:color="CBD5E1"/>
+              <w:left w:val="single" w:sz="6" w:space="0" w:color="CBD5E1"/>
+              <w:bottom w:val="single" w:sz="6" w:space="0" w:color="CBD5E1"/>
+              <w:right w:val="single" w:sz="6" w:space="0" w:color="CBD5E1"/>
+            </w:tcBorders>
+            <w:tcMar>
+              <w:top w:w="60" w:type="dxa"/>
+              <w:left w:w="100" w:type="dxa"/>
+              <w:bottom w:w="60" w:type="dxa"/>
+              <w:right w:w="100" w:type="dxa"/>
+            </w:tcMar>
+            <w:hideMark/>
+          </w:tcPr>
+          <w:p>
+            <w:pPr>
+              <w:spacing w:before="120" w:after="120"/>
+              <w:rPr>
+                <w:rFonts w:ascii="Calibri" w:eastAsia="Times New Roman" w:hAnsi="Calibri" w:cs="Calibri"/>
+                <w:color w:val="1F2937"/>
+                <w:sz w:val="19"/>
+                <w:szCs w:val="19"/>
+              </w:rPr>
+            </w:pPr>
+            <w:r>
+              <w:rPr>
+                <w:rFonts w:ascii="Calibri" w:eastAsia="Times New Roman" w:hAnsi="Calibri" w:cs="Calibri"/>
+                <w:color w:val="1F2937"/>
+                <w:sz w:val="19"/>
+                <w:szCs w:val="19"/>
+              </w:rPr>
+              <w:t>—</w:t>
+            </w:r>
+          </w:p>
+        </w:tc>
+        <w:tc>
+          <w:tcPr>
+            <w:tcW w:w="0" w:type="auto"/>
+            <w:tcBorders>
+              <w:top w:val="single" w:sz="6" w:space="0" w:color="CBD5E1"/>
+              <w:left w:val="single" w:sz="6" w:space="0" w:color="CBD5E1"/>
+              <w:bottom w:val="single" w:sz="6" w:space="0" w:color="CBD5E1"/>
+              <w:right w:val="single" w:sz="6" w:space="0" w:color="CBD5E1"/>
+            </w:tcBorders>
+            <w:tcMar>
+              <w:top w:w="60" w:type="dxa"/>
+              <w:left w:w="100" w:type="dxa"/>
+              <w:bottom w:w="60" w:type="dxa"/>
+              <w:right w:w="100" w:type="dxa"/>
+            </w:tcMar>
+            <w:hideMark/>
+          </w:tcPr>
+          <w:p>
+            <w:pPr>
+              <w:spacing w:before="120" w:after="120"/>
+              <w:rPr>
+                <w:rFonts w:ascii="Calibri" w:eastAsia="Times New Roman" w:hAnsi="Calibri" w:cs="Calibri"/>
+                <w:color w:val="1F2937"/>
+                <w:sz w:val="19"/>
+                <w:szCs w:val="19"/>
+              </w:rPr>
+            </w:pPr>
+            <w:r>
+              <w:rPr>
+                <w:rFonts w:ascii="Calibri" w:eastAsia="Times New Roman" w:hAnsi="Calibri" w:cs="Calibri"/>
+                <w:color w:val="1F2937"/>
+                <w:sz w:val="19"/>
+                <w:szCs w:val="19"/>
+              </w:rPr>
+              <w:t>—</w:t>
+            </w:r>
+          </w:p>
+        </w:tc>
+      </w:tr>
+      <w:tr>
+        <w:tc>
+          <w:tcPr>
+            <w:tcW w:w="0" w:type="auto"/>
+            <w:tcBorders>
+              <w:top w:val="single" w:sz="6" w:space="0" w:color="CBD5E1"/>
+              <w:left w:val="single" w:sz="6" w:space="0" w:color="CBD5E1"/>
+              <w:bottom w:val="single" w:sz="6" w:space="0" w:color="CBD5E1"/>
+              <w:right w:val="single" w:sz="6" w:space="0" w:color="CBD5E1"/>
+            </w:tcBorders>
+            <w:tcMar>
+              <w:top w:w="60" w:type="dxa"/>
+              <w:left w:w="100" w:type="dxa"/>
+              <w:bottom w:w="60" w:type="dxa"/>
+              <w:right w:w="100" w:type="dxa"/>
+            </w:tcMar>
+            <w:hideMark/>
+          </w:tcPr>
+          <w:p>
+            <w:pPr>
+              <w:spacing w:before="120" w:after="120"/>
+              <w:rPr>
+                <w:rFonts w:ascii="Calibri" w:eastAsia="Times New Roman" w:hAnsi="Calibri" w:cs="Calibri"/>
+                <w:color w:val="1F2937"/>
+                <w:sz w:val="19"/>
+                <w:szCs w:val="19"/>
+              </w:rPr>
+            </w:pPr>
+            <w:r>
+              <w:rPr>
+                <w:rFonts w:ascii="Calibri" w:eastAsia="Times New Roman" w:hAnsi="Calibri" w:cs="Calibri"/>
+                <w:color w:val="1F2937"/>
+                <w:sz w:val="19"/>
+                <w:szCs w:val="19"/>
+              </w:rPr>
+              <w:t>estudiantes(</w:t>
+            </w:r>
+            <w:r>
+              <w:rPr>
+                <w:rFonts w:ascii="Calibri" w:eastAsia="Times New Roman" w:hAnsi="Calibri" w:cs="Calibri"/>
+                <w:color w:val="1F2937"/>
+                <w:sz w:val="19"/>
+                <w:szCs w:val="19"/>
+                <w:u w:val="single"/>
+              </w:rPr>
+              <w:t>id_socio</w:t>
+            </w:r>
+            <w:r>
+              <w:rPr>
+                <w:rFonts w:ascii="Calibri" w:eastAsia="Times New Roman" w:hAnsi="Calibri" w:cs="Calibri"/>
+                <w:color w:val="1F2937"/>
+                <w:sz w:val="19"/>
+                <w:szCs w:val="19"/>
+              </w:rPr>
+              <w:t xml:space="preserve">, tipo_socio, programa, semestre) </w:t>
+            </w:r>
+            <w:r>
+              <w:rPr>
+                <w:rFonts w:ascii="Segoe UI Symbol" w:eastAsia="Times New Roman" w:hAnsi="Segoe UI Symbol" w:cs="Segoe UI Symbol"/>
+                <w:color w:val="1F2937"/>
+                <w:sz w:val="19"/>
+                <w:szCs w:val="19"/>
+              </w:rPr>
+              <w:t>★</w:t>
+            </w:r>
+            <w:r>
+              <w:rPr>
+                <w:rFonts w:ascii="Calibri" w:eastAsia="Times New Roman" w:hAnsi="Calibri" w:cs="Calibri"/>
+                <w:color w:val="1F2937"/>
+                <w:sz w:val="19"/>
+                <w:szCs w:val="19"/>
+              </w:rPr>
+              <w:t xml:space="preserve"> nueva</w:t>
+            </w:r>
+          </w:p>
+        </w:tc>
+        <w:tc>
+          <w:tcPr>
+            <w:tcW w:w="0" w:type="auto"/>
+            <w:tcBorders>
+              <w:top w:val="single" w:sz="6" w:space="0" w:color="CBD5E1"/>
+              <w:left w:val="single" w:sz="6" w:space="0" w:color="CBD5E1"/>
+              <w:bottom w:val="single" w:sz="6" w:space="0" w:color="CBD5E1"/>
+              <w:right w:val="single" w:sz="6" w:space="0" w:color="CBD5E1"/>
+            </w:tcBorders>
+            <w:tcMar>
+              <w:top w:w="60" w:type="dxa"/>
+              <w:left w:w="100" w:type="dxa"/>
+              <w:bottom w:w="60" w:type="dxa"/>
+              <w:right w:w="100" w:type="dxa"/>
+            </w:tcMar>
+            <w:hideMark/>
+          </w:tcPr>
+          <w:p>
+            <w:pPr>
+              <w:spacing w:before="120" w:after="120"/>
+              <w:rPr>
+                <w:rFonts w:ascii="Calibri" w:eastAsia="Times New Roman" w:hAnsi="Calibri" w:cs="Calibri"/>
+                <w:color w:val="1F2937"/>
+                <w:sz w:val="19"/>
+                <w:szCs w:val="19"/>
+              </w:rPr>
+            </w:pPr>
+            <w:r>
+              <w:rPr>
+                <w:rFonts w:ascii="Calibri" w:eastAsia="Times New Roman" w:hAnsi="Calibri" w:cs="Calibri"/>
+                <w:color w:val="1F2937"/>
+                <w:sz w:val="19"/>
+                <w:szCs w:val="19"/>
+              </w:rPr>
+              <w:t>(id_socio, tipo_socio) → socios</w:t>
+            </w:r>
+          </w:p>
+        </w:tc>
+        <w:tc>
+          <w:tcPr>
+            <w:tcW w:w="0" w:type="auto"/>
+            <w:tcBorders>
+              <w:top w:val="single" w:sz="6" w:space="0" w:color="CBD5E1"/>
+              <w:left w:val="single" w:sz="6" w:space="0" w:color="CBD5E1"/>
+              <w:bottom w:val="single" w:sz="6" w:space="0" w:color="CBD5E1"/>
+              <w:right w:val="single" w:sz="6" w:space="0" w:color="CBD5E1"/>
+            </w:tcBorders>
+            <w:tcMar>
+              <w:top w:w="60" w:type="dxa"/>
+              <w:left w:w="100" w:type="dxa"/>
+              <w:bottom w:w="60" w:type="dxa"/>
+              <w:right w:w="100" w:type="dxa"/>
+            </w:tcMar>
+            <w:hideMark/>
+          </w:tcPr>
+          <w:p>
+            <w:pPr>
+              <w:spacing w:before="120" w:after="120"/>
+              <w:rPr>
+                <w:rFonts w:ascii="Calibri" w:eastAsia="Times New Roman" w:hAnsi="Calibri" w:cs="Calibri"/>
+                <w:color w:val="1F2937"/>
+                <w:sz w:val="19"/>
+                <w:szCs w:val="19"/>
+              </w:rPr>
+            </w:pPr>
+            <w:r>
+              <w:rPr>
+                <w:rFonts w:ascii="Calibri" w:eastAsia="Times New Roman" w:hAnsi="Calibri" w:cs="Calibri"/>
+                <w:color w:val="1F2937"/>
+                <w:sz w:val="19"/>
+                <w:szCs w:val="19"/>
+              </w:rPr>
+              <w:t>CASCADE: la subclase no existe sin el socio</w:t>
+            </w:r>
+          </w:p>
+        </w:tc>
+      </w:tr>
+      <w:tr>
+        <w:tc>
+          <w:tcPr>
+            <w:tcW w:w="0" w:type="auto"/>
+            <w:tcBorders>
+              <w:top w:val="single" w:sz="6" w:space="0" w:color="CBD5E1"/>
+              <w:left w:val="single" w:sz="6" w:space="0" w:color="CBD5E1"/>
+              <w:bottom w:val="single" w:sz="6" w:space="0" w:color="CBD5E1"/>
+              <w:right w:val="single" w:sz="6" w:space="0" w:color="CBD5E1"/>
+            </w:tcBorders>
+            <w:tcMar>
+              <w:top w:w="60" w:type="dxa"/>
+              <w:left w:w="100" w:type="dxa"/>
+              <w:bottom w:w="60" w:type="dxa"/>
+              <w:right w:w="100" w:type="dxa"/>
+            </w:tcMar>
+            <w:hideMark/>
+          </w:tcPr>
+          <w:p>
+            <w:pPr>
+              <w:spacing w:before="120" w:after="120"/>
+              <w:rPr>
+                <w:rFonts w:ascii="Calibri" w:eastAsia="Times New Roman" w:hAnsi="Calibri" w:cs="Calibri"/>
+                <w:color w:val="1F2937"/>
+                <w:sz w:val="19"/>
+                <w:szCs w:val="19"/>
+              </w:rPr>
+            </w:pPr>
+            <w:r>
+              <w:rPr>
+                <w:rFonts w:ascii="Calibri" w:eastAsia="Times New Roman" w:hAnsi="Calibri" w:cs="Calibri"/>
+                <w:color w:val="1F2937"/>
+                <w:sz w:val="19"/>
+                <w:szCs w:val="19"/>
+              </w:rPr>
+              <w:t>docentes(</w:t>
+            </w:r>
+            <w:r>
+              <w:rPr>
+                <w:rFonts w:ascii="Calibri" w:eastAsia="Times New Roman" w:hAnsi="Calibri" w:cs="Calibri"/>
+                <w:color w:val="1F2937"/>
+                <w:sz w:val="19"/>
+                <w:szCs w:val="19"/>
+                <w:u w:val="single"/>
+              </w:rPr>
+              <w:t>id_socio</w:t>
+            </w:r>
+            <w:r>
+              <w:rPr>
+                <w:rFonts w:ascii="Calibri" w:eastAsia="Times New Roman" w:hAnsi="Calibri" w:cs="Calibri"/>
+                <w:color w:val="1F2937"/>
+                <w:sz w:val="19"/>
+                <w:szCs w:val="19"/>
+              </w:rPr>
+              <w:t xml:space="preserve">, tipo_socio, departamento, tipo_vinculacion) </w:t>
+            </w:r>
+            <w:r>
+              <w:rPr>
+                <w:rFonts w:ascii="Segoe UI Symbol" w:eastAsia="Times New Roman" w:hAnsi="Segoe UI Symbol" w:cs="Segoe UI Symbol"/>
+                <w:color w:val="1F2937"/>
+                <w:sz w:val="19"/>
+                <w:szCs w:val="19"/>
+              </w:rPr>
+              <w:t>★</w:t>
+            </w:r>
+            <w:r>
+              <w:rPr>
+                <w:rFonts w:ascii="Calibri" w:eastAsia="Times New Roman" w:hAnsi="Calibri" w:cs="Calibri"/>
+                <w:color w:val="1F2937"/>
+                <w:sz w:val="19"/>
+                <w:szCs w:val="19"/>
+              </w:rPr>
+              <w:t xml:space="preserve"> nueva</w:t>
+            </w:r>
+          </w:p>
+        </w:tc>
+        <w:tc>
+          <w:tcPr>
+            <w:tcW w:w="0" w:type="auto"/>
+            <w:tcBorders>
+              <w:top w:val="single" w:sz="6" w:space="0" w:color="CBD5E1"/>
+              <w:left w:val="single" w:sz="6" w:space="0" w:color="CBD5E1"/>
+              <w:bottom w:val="single" w:sz="6" w:space="0" w:color="CBD5E1"/>
+              <w:right w:val="single" w:sz="6" w:space="0" w:color="CBD5E1"/>
+            </w:tcBorders>
+            <w:tcMar>
+              <w:top w:w="60" w:type="dxa"/>
+              <w:left w:w="100" w:type="dxa"/>
+              <w:bottom w:w="60" w:type="dxa"/>
+              <w:right w:w="100" w:type="dxa"/>
+            </w:tcMar>
+            <w:hideMark/>
+          </w:tcPr>
+          <w:p>
+            <w:pPr>
+              <w:spacing w:before="120" w:after="120"/>
+              <w:rPr>
+                <w:rFonts w:ascii="Calibri" w:eastAsia="Times New Roman" w:hAnsi="Calibri" w:cs="Calibri"/>
+                <w:color w:val="1F2937"/>
+                <w:sz w:val="19"/>
+                <w:szCs w:val="19"/>
+              </w:rPr>
+            </w:pPr>
+            <w:r>
+              <w:rPr>
+                <w:rFonts w:ascii="Calibri" w:eastAsia="Times New Roman" w:hAnsi="Calibri" w:cs="Calibri"/>
+                <w:color w:val="1F2937"/>
+                <w:sz w:val="19"/>
+                <w:szCs w:val="19"/>
+              </w:rPr>
+              <w:t>(id_socio, tipo_socio) → socios</w:t>
+            </w:r>
+          </w:p>
+        </w:tc>
+        <w:tc>
+          <w:tcPr>
+            <w:tcW w:w="0" w:type="auto"/>
+            <w:tcBorders>
+              <w:top w:val="single" w:sz="6" w:space="0" w:color="CBD5E1"/>
+              <w:left w:val="single" w:sz="6" w:space="0" w:color="CBD5E1"/>
+              <w:bottom w:val="single" w:sz="6" w:space="0" w:color="CBD5E1"/>
+              <w:right w:val="single" w:sz="6" w:space="0" w:color="CBD5E1"/>
+            </w:tcBorders>
+            <w:tcMar>
+              <w:top w:w="60" w:type="dxa"/>
+              <w:left w:w="100" w:type="dxa"/>
+              <w:bottom w:w="60" w:type="dxa"/>
+              <w:right w:w="100" w:type="dxa"/>
+            </w:tcMar>
+            <w:hideMark/>
+          </w:tcPr>
+          <w:p>
+            <w:pPr>
+              <w:spacing w:before="120" w:after="120"/>
+              <w:rPr>
+                <w:rFonts w:ascii="Calibri" w:eastAsia="Times New Roman" w:hAnsi="Calibri" w:cs="Calibri"/>
+                <w:color w:val="1F2937"/>
+                <w:sz w:val="19"/>
+                <w:szCs w:val="19"/>
+              </w:rPr>
+            </w:pPr>
+            <w:r>
+              <w:rPr>
+                <w:rFonts w:ascii="Calibri" w:eastAsia="Times New Roman" w:hAnsi="Calibri" w:cs="Calibri"/>
+                <w:color w:val="1F2937"/>
+                <w:sz w:val="19"/>
+                <w:szCs w:val="19"/>
+              </w:rPr>
+              <w:t>CASCADE: la subclase no existe sin el socio</w:t>
+            </w:r>
+          </w:p>
+        </w:tc>
+      </w:tr>
+      <w:tr>
+        <w:tc>
+          <w:tcPr>
+            <w:tcW w:w="0" w:type="auto"/>
+            <w:tcBorders>
+              <w:top w:val="single" w:sz="6" w:space="0" w:color="CBD5E1"/>
+              <w:left w:val="single" w:sz="6" w:space="0" w:color="CBD5E1"/>
+              <w:bottom w:val="single" w:sz="6" w:space="0" w:color="CBD5E1"/>
+              <w:right w:val="single" w:sz="6" w:space="0" w:color="CBD5E1"/>
+            </w:tcBorders>
+            <w:tcMar>
+              <w:top w:w="60" w:type="dxa"/>
+              <w:left w:w="100" w:type="dxa"/>
+              <w:bottom w:w="60" w:type="dxa"/>
+              <w:right w:w="100" w:type="dxa"/>
+            </w:tcMar>
+            <w:hideMark/>
+          </w:tcPr>
+          <w:p>
+            <w:pPr>
+              <w:spacing w:before="120" w:after="120"/>
+              <w:rPr>
+                <w:rFonts w:ascii="Calibri" w:eastAsia="Times New Roman" w:hAnsi="Calibri" w:cs="Calibri"/>
+                <w:color w:val="1F2937"/>
+                <w:sz w:val="19"/>
+                <w:szCs w:val="19"/>
+              </w:rPr>
+            </w:pPr>
+            <w:r>
+              <w:rPr>
+                <w:rFonts w:ascii="Calibri" w:eastAsia="Times New Roman" w:hAnsi="Calibri" w:cs="Calibri"/>
+                <w:color w:val="1F2937"/>
+                <w:sz w:val="19"/>
+                <w:szCs w:val="19"/>
+              </w:rPr>
+              <w:t>bibliotecarios(</w:t>
+            </w:r>
+            <w:r>
+              <w:rPr>
+                <w:rFonts w:ascii="Calibri" w:eastAsia="Times New Roman" w:hAnsi="Calibri" w:cs="Calibri"/>
+                <w:color w:val="1F2937"/>
+                <w:sz w:val="19"/>
+                <w:szCs w:val="19"/>
+                <w:u w:val="single"/>
+              </w:rPr>
+              <w:t>id_bibliotecario</w:t>
+            </w:r>
+            <w:r>
+              <w:rPr>
+                <w:rFonts w:ascii="Calibri" w:eastAsia="Times New Roman" w:hAnsi="Calibri" w:cs="Calibri"/>
+                <w:color w:val="1F2937"/>
+                <w:sz w:val="19"/>
+                <w:szCs w:val="19"/>
+              </w:rPr>
+              <w:t>, nombre)</w:t>
+            </w:r>
+          </w:p>
+        </w:tc>
+        <w:tc>
+          <w:tcPr>
+            <w:tcW w:w="0" w:type="auto"/>
+            <w:tcBorders>
+              <w:top w:val="single" w:sz="6" w:space="0" w:color="CBD5E1"/>
+              <w:left w:val="single" w:sz="6" w:space="0" w:color="CBD5E1"/>
+              <w:bottom w:val="single" w:sz="6" w:space="0" w:color="CBD5E1"/>
+              <w:right w:val="single" w:sz="6" w:space="0" w:color="CBD5E1"/>
+            </w:tcBorders>
+            <w:tcMar>
+              <w:top w:w="60" w:type="dxa"/>
+              <w:left w:w="100" w:type="dxa"/>
+              <w:bottom w:w="60" w:type="dxa"/>
+              <w:right w:w="100" w:type="dxa"/>
+            </w:tcMar>
+            <w:hideMark/>
+          </w:tcPr>
+          <w:p>
+            <w:pPr>
+              <w:spacing w:before="120" w:after="120"/>
+              <w:rPr>
+                <w:rFonts w:ascii="Calibri" w:eastAsia="Times New Roman" w:hAnsi="Calibri" w:cs="Calibri"/>
+                <w:color w:val="1F2937"/>
+                <w:sz w:val="19"/>
+                <w:szCs w:val="19"/>
+              </w:rPr>
+            </w:pPr>
+            <w:r>
+              <w:rPr>
+                <w:rFonts w:ascii="Calibri" w:eastAsia="Times New Roman" w:hAnsi="Calibri" w:cs="Calibri"/>
+                <w:color w:val="1F2937"/>
+                <w:sz w:val="19"/>
+                <w:szCs w:val="19"/>
+              </w:rPr>
+              <w:t>—</w:t>
+            </w:r>
+          </w:p>
+        </w:tc>
+        <w:tc>
+          <w:tcPr>
+            <w:tcW w:w="0" w:type="auto"/>
+            <w:tcBorders>
+              <w:top w:val="single" w:sz="6" w:space="0" w:color="CBD5E1"/>
+              <w:left w:val="single" w:sz="6" w:space="0" w:color="CBD5E1"/>
+              <w:bottom w:val="single" w:sz="6" w:space="0" w:color="CBD5E1"/>
+              <w:right w:val="single" w:sz="6" w:space="0" w:color="CBD5E1"/>
+            </w:tcBorders>
+            <w:tcMar>
+              <w:top w:w="60" w:type="dxa"/>
+              <w:left w:w="100" w:type="dxa"/>
+              <w:bottom w:w="60" w:type="dxa"/>
+              <w:right w:w="100" w:type="dxa"/>
+            </w:tcMar>
+            <w:hideMark/>
+          </w:tcPr>
+          <w:p>
+            <w:pPr>
+              <w:spacing w:before="120" w:after="120"/>
+              <w:rPr>
+                <w:rFonts w:ascii="Calibri" w:eastAsia="Times New Roman" w:hAnsi="Calibri" w:cs="Calibri"/>
+                <w:color w:val="1F2937"/>
+                <w:sz w:val="19"/>
+                <w:szCs w:val="19"/>
+              </w:rPr>
+            </w:pPr>
+            <w:r>
+              <w:rPr>
+                <w:rFonts w:ascii="Calibri" w:eastAsia="Times New Roman" w:hAnsi="Calibri" w:cs="Calibri"/>
+                <w:color w:val="1F2937"/>
+                <w:sz w:val="19"/>
+                <w:szCs w:val="19"/>
+              </w:rPr>
+              <w:t>—</w:t>
+            </w:r>
+          </w:p>
+        </w:tc>
+      </w:tr>
+      <w:tr>
+        <w:tc>
+          <w:tcPr>
+            <w:tcW w:w="0" w:type="auto"/>
+            <w:tcBorders>
+              <w:top w:val="single" w:sz="6" w:space="0" w:color="CBD5E1"/>
+              <w:left w:val="single" w:sz="6" w:space="0" w:color="CBD5E1"/>
+              <w:bottom w:val="single" w:sz="6" w:space="0" w:color="CBD5E1"/>
+              <w:right w:val="single" w:sz="6" w:space="0" w:color="CBD5E1"/>
+            </w:tcBorders>
+            <w:tcMar>
+              <w:top w:w="60" w:type="dxa"/>
+              <w:left w:w="100" w:type="dxa"/>
+              <w:bottom w:w="60" w:type="dxa"/>
+              <w:right w:w="100" w:type="dxa"/>
+            </w:tcMar>
+            <w:hideMark/>
+          </w:tcPr>
+          <w:p>
+            <w:pPr>
+              <w:spacing w:before="120" w:after="120"/>
+              <w:rPr>
+                <w:rFonts w:ascii="Calibri" w:eastAsia="Times New Roman" w:hAnsi="Calibri" w:cs="Calibri"/>
+                <w:color w:val="1F2937"/>
+                <w:sz w:val="19"/>
+                <w:szCs w:val="19"/>
+              </w:rPr>
+            </w:pPr>
+            <w:r>
+              <w:rPr>
+                <w:rFonts w:ascii="Calibri" w:eastAsia="Times New Roman" w:hAnsi="Calibri" w:cs="Calibri"/>
+                <w:color w:val="1F2937"/>
+                <w:sz w:val="19"/>
+                <w:szCs w:val="19"/>
+              </w:rPr>
+              <w:t>prestamos(</w:t>
+            </w:r>
+            <w:r>
+              <w:rPr>
+                <w:rFonts w:ascii="Calibri" w:eastAsia="Times New Roman" w:hAnsi="Calibri" w:cs="Calibri"/>
+                <w:color w:val="1F2937"/>
+                <w:sz w:val="19"/>
+                <w:szCs w:val="19"/>
+                <w:u w:val="single"/>
+              </w:rPr>
+              <w:t>id_prestamo</w:t>
+            </w:r>
+            <w:r>
+              <w:rPr>
+                <w:rFonts w:ascii="Calibri" w:eastAsia="Times New Roman" w:hAnsi="Calibri" w:cs="Calibri"/>
+                <w:color w:val="1F2937"/>
+                <w:sz w:val="19"/>
+                <w:szCs w:val="19"/>
+              </w:rPr>
+              <w:t>, id_libro, num_ejemplar, id_socio, id_bibliotecario, fecha_prestamo, fecha_devolucion_esperada, fecha_devolucion_real)</w:t>
+            </w:r>
+          </w:p>
+        </w:tc>
+        <w:tc>
+          <w:tcPr>
+            <w:tcW w:w="0" w:type="auto"/>
+            <w:tcBorders>
+              <w:top w:val="single" w:sz="6" w:space="0" w:color="CBD5E1"/>
+              <w:left w:val="single" w:sz="6" w:space="0" w:color="CBD5E1"/>
+              <w:bottom w:val="single" w:sz="6" w:space="0" w:color="CBD5E1"/>
+              <w:right w:val="single" w:sz="6" w:space="0" w:color="CBD5E1"/>
+            </w:tcBorders>
+            <w:tcMar>
+              <w:top w:w="60" w:type="dxa"/>
+              <w:left w:w="100" w:type="dxa"/>
+              <w:bottom w:w="60" w:type="dxa"/>
+              <w:right w:w="100" w:type="dxa"/>
+            </w:tcMar>
+            <w:hideMark/>
+          </w:tcPr>
+          <w:p>
+            <w:pPr>
+              <w:spacing w:before="120" w:after="120"/>
+              <w:rPr>
+                <w:rFonts w:ascii="Calibri" w:eastAsia="Times New Roman" w:hAnsi="Calibri" w:cs="Calibri"/>
+                <w:color w:val="1F2937"/>
+                <w:sz w:val="19"/>
+                <w:szCs w:val="19"/>
+              </w:rPr>
+            </w:pPr>
+            <w:r>
+              <w:rPr>
+                <w:rFonts w:ascii="Calibri" w:eastAsia="Times New Roman" w:hAnsi="Calibri" w:cs="Calibri"/>
+                <w:color w:val="1F2937"/>
+                <w:sz w:val="19"/>
+                <w:szCs w:val="19"/>
+              </w:rPr>
+              <w:t>(id_libro, num_ejemplar) → ejemplares</w:t>
+            </w:r>
+            <w:r>
+              <w:rPr>
+                <w:rFonts w:ascii="Calibri" w:eastAsia="Times New Roman" w:hAnsi="Calibri" w:cs="Calibri"/>
+                <w:color w:val="1F2937"/>
+                <w:sz w:val="19"/>
+                <w:szCs w:val="19"/>
+              </w:rPr>
+              <w:br/>
+              <w:t>id_socio → socios</w:t>
+            </w:r>
+            <w:r>
+              <w:rPr>
+                <w:rFonts w:ascii="Calibri" w:eastAsia="Times New Roman" w:hAnsi="Calibri" w:cs="Calibri"/>
+                <w:color w:val="1F2937"/>
+                <w:sz w:val="19"/>
+                <w:szCs w:val="19"/>
+              </w:rPr>
+              <w:br/>
+              <w:t>id_bibliotecario → bibliotecarios</w:t>
+            </w:r>
+          </w:p>
+        </w:tc>
+        <w:tc>
+          <w:tcPr>
+            <w:tcW w:w="0" w:type="auto"/>
+            <w:tcBorders>
+              <w:top w:val="single" w:sz="6" w:space="0" w:color="CBD5E1"/>
+              <w:left w:val="single" w:sz="6" w:space="0" w:color="CBD5E1"/>
+              <w:bottom w:val="single" w:sz="6" w:space="0" w:color="CBD5E1"/>
+              <w:right w:val="single" w:sz="6" w:space="0" w:color="CBD5E1"/>
+            </w:tcBorders>
+            <w:tcMar>
+              <w:top w:w="60" w:type="dxa"/>
+              <w:left w:w="100" w:type="dxa"/>
+              <w:bottom w:w="60" w:type="dxa"/>
+              <w:right w:w="100" w:type="dxa"/>
+            </w:tcMar>
+            <w:hideMark/>
+          </w:tcPr>
+          <w:p>
+            <w:pPr>
+              <w:spacing w:before="120" w:after="120"/>
+              <w:rPr>
+                <w:rFonts w:ascii="Calibri" w:eastAsia="Times New Roman" w:hAnsi="Calibri" w:cs="Calibri"/>
+                <w:color w:val="1F2937"/>
+                <w:sz w:val="19"/>
+                <w:szCs w:val="19"/>
+              </w:rPr>
+            </w:pPr>
+            <w:r>
+              <w:rPr>
+                <w:rFonts w:ascii="Calibri" w:eastAsia="Times New Roman" w:hAnsi="Calibri" w:cs="Calibri"/>
+                <w:color w:val="1F2937"/>
+                <w:sz w:val="19"/>
+                <w:szCs w:val="19"/>
+              </w:rPr>
+              <w:t>RESTRICT en las tres: el préstamo es historial</w:t>
+            </w:r>
+          </w:p>
+        </w:tc>
+      </w:tr>
+      <w:tr>
+        <w:tc>
+          <w:tcPr>
+            <w:tcW w:w="0" w:type="auto"/>
+            <w:tcBorders>
+              <w:top w:val="single" w:sz="6" w:space="0" w:color="CBD5E1"/>
+              <w:left w:val="single" w:sz="6" w:space="0" w:color="CBD5E1"/>
+              <w:bottom w:val="single" w:sz="6" w:space="0" w:color="CBD5E1"/>
+              <w:right w:val="single" w:sz="6" w:space="0" w:color="CBD5E1"/>
+            </w:tcBorders>
+            <w:tcMar>
+              <w:top w:w="60" w:type="dxa"/>
+              <w:left w:w="100" w:type="dxa"/>
+              <w:bottom w:w="60" w:type="dxa"/>
+              <w:right w:w="100" w:type="dxa"/>
+            </w:tcMar>
+            <w:hideMark/>
+          </w:tcPr>
+          <w:p>
+            <w:pPr>
+              <w:spacing w:before="120" w:after="120"/>
+              <w:rPr>
+                <w:rFonts w:ascii="Calibri" w:eastAsia="Times New Roman" w:hAnsi="Calibri" w:cs="Calibri"/>
+                <w:color w:val="1F2937"/>
+                <w:sz w:val="19"/>
+                <w:szCs w:val="19"/>
+              </w:rPr>
+            </w:pPr>
+            <w:r>
+              <w:rPr>
+                <w:rFonts w:ascii="Calibri" w:eastAsia="Times New Roman" w:hAnsi="Calibri" w:cs="Calibri"/>
+                <w:color w:val="1F2937"/>
+                <w:sz w:val="19"/>
+                <w:szCs w:val="19"/>
+              </w:rPr>
+              <w:t>reservas(</w:t>
+            </w:r>
+            <w:r>
+              <w:rPr>
+                <w:rFonts w:ascii="Calibri" w:eastAsia="Times New Roman" w:hAnsi="Calibri" w:cs="Calibri"/>
+                <w:color w:val="1F2937"/>
+                <w:sz w:val="19"/>
+                <w:szCs w:val="19"/>
+                <w:u w:val="single"/>
+              </w:rPr>
+              <w:t>id_reserva</w:t>
+            </w:r>
+            <w:r>
+              <w:rPr>
+                <w:rFonts w:ascii="Calibri" w:eastAsia="Times New Roman" w:hAnsi="Calibri" w:cs="Calibri"/>
+                <w:color w:val="1F2937"/>
+                <w:sz w:val="19"/>
+                <w:szCs w:val="19"/>
+              </w:rPr>
+              <w:t>, id_libro, id_socio, fecha_reserva, estado)</w:t>
+            </w:r>
+          </w:p>
+        </w:tc>
+        <w:tc>
+          <w:tcPr>
+            <w:tcW w:w="0" w:type="auto"/>
+            <w:tcBorders>
+              <w:top w:val="single" w:sz="6" w:space="0" w:color="CBD5E1"/>
+              <w:left w:val="single" w:sz="6" w:space="0" w:color="CBD5E1"/>
+              <w:bottom w:val="single" w:sz="6" w:space="0" w:color="CBD5E1"/>
+              <w:right w:val="single" w:sz="6" w:space="0" w:color="CBD5E1"/>
+            </w:tcBorders>
+            <w:tcMar>
+              <w:top w:w="60" w:type="dxa"/>
+              <w:left w:w="100" w:type="dxa"/>
+              <w:bottom w:w="60" w:type="dxa"/>
+              <w:right w:w="100" w:type="dxa"/>
+            </w:tcMar>
+            <w:hideMark/>
+          </w:tcPr>
+          <w:p>
+            <w:pPr>
+              <w:spacing w:before="120" w:after="120"/>
+              <w:rPr>
+                <w:rFonts w:ascii="Calibri" w:eastAsia="Times New Roman" w:hAnsi="Calibri" w:cs="Calibri"/>
+                <w:color w:val="1F2937"/>
+                <w:sz w:val="19"/>
+                <w:szCs w:val="19"/>
+              </w:rPr>
+            </w:pPr>
+            <w:r>
+              <w:rPr>
+                <w:rFonts w:ascii="Calibri" w:eastAsia="Times New Roman" w:hAnsi="Calibri" w:cs="Calibri"/>
+                <w:color w:val="1F2937"/>
+                <w:sz w:val="19"/>
+                <w:szCs w:val="19"/>
+              </w:rPr>
+              <w:t>id_libro → libros</w:t>
+            </w:r>
+            <w:r>
+              <w:rPr>
+                <w:rFonts w:ascii="Calibri" w:eastAsia="Times New Roman" w:hAnsi="Calibri" w:cs="Calibri"/>
+                <w:color w:val="1F2937"/>
+                <w:sz w:val="19"/>
+                <w:szCs w:val="19"/>
+              </w:rPr>
+              <w:br/>
+              <w:t>id_socio → socios</w:t>
+            </w:r>
+          </w:p>
+        </w:tc>
+        <w:tc>
+          <w:tcPr>
+            <w:tcW w:w="0" w:type="auto"/>
+            <w:tcBorders>
+              <w:top w:val="single" w:sz="6" w:space="0" w:color="CBD5E1"/>
+              <w:left w:val="single" w:sz="6" w:space="0" w:color="CBD5E1"/>
+              <w:bottom w:val="single" w:sz="6" w:space="0" w:color="CBD5E1"/>
+              <w:right w:val="single" w:sz="6" w:space="0" w:color="CBD5E1"/>
+            </w:tcBorders>
+            <w:tcMar>
+              <w:top w:w="60" w:type="dxa"/>
+              <w:left w:w="100" w:type="dxa"/>
+              <w:bottom w:w="60" w:type="dxa"/>
+              <w:right w:w="100" w:type="dxa"/>
+            </w:tcMar>
+            <w:hideMark/>
+          </w:tcPr>
+          <w:p>
+            <w:pPr>
+              <w:spacing w:before="120" w:after="120"/>
+              <w:rPr>
+                <w:rFonts w:ascii="Calibri" w:eastAsia="Times New Roman" w:hAnsi="Calibri" w:cs="Calibri"/>
+                <w:color w:val="1F2937"/>
+                <w:sz w:val="19"/>
+                <w:szCs w:val="19"/>
+              </w:rPr>
+            </w:pPr>
+            <w:r>
+              <w:rPr>
+                <w:rFonts w:ascii="Calibri" w:eastAsia="Times New Roman" w:hAnsi="Calibri" w:cs="Calibri"/>
+                <w:color w:val="1F2937"/>
+                <w:sz w:val="19"/>
+                <w:szCs w:val="19"/>
+              </w:rPr>
+              <w:t>RESTRICT si se borra el libro</w:t>
+            </w:r>
+            <w:r>
+              <w:rPr>
+                <w:rFonts w:ascii="Calibri" w:eastAsia="Times New Roman" w:hAnsi="Calibri" w:cs="Calibri"/>
+                <w:color w:val="1F2937"/>
+                <w:sz w:val="19"/>
+                <w:szCs w:val="19"/>
+              </w:rPr>
+              <w:br/>
+              <w:t>CASCADE si se borra el socio</w:t>
+            </w:r>
+          </w:p>
+        </w:tc>
+      </w:tr>
+      <w:tr>
+        <w:tc>
+          <w:tcPr>
+            <w:tcW w:w="0" w:type="auto"/>
+            <w:tcBorders>
+              <w:top w:val="single" w:sz="6" w:space="0" w:color="CBD5E1"/>
+              <w:left w:val="single" w:sz="6" w:space="0" w:color="CBD5E1"/>
+              <w:bottom w:val="single" w:sz="6" w:space="0" w:color="CBD5E1"/>
+              <w:right w:val="single" w:sz="6" w:space="0" w:color="CBD5E1"/>
+            </w:tcBorders>
+            <w:tcMar>
+              <w:top w:w="60" w:type="dxa"/>
+              <w:left w:w="100" w:type="dxa"/>
+              <w:bottom w:w="60" w:type="dxa"/>
+              <w:right w:w="100" w:type="dxa"/>
+            </w:tcMar>
+            <w:hideMark/>
+          </w:tcPr>
+          <w:p>
+            <w:pPr>
+              <w:spacing w:before="120" w:after="120"/>
+              <w:rPr>
+                <w:rFonts w:ascii="Calibri" w:eastAsia="Times New Roman" w:hAnsi="Calibri" w:cs="Calibri"/>
+                <w:color w:val="1F2937"/>
+                <w:sz w:val="19"/>
+                <w:szCs w:val="19"/>
+              </w:rPr>
+            </w:pPr>
+            <w:r>
+              <w:rPr>
+                <w:rFonts w:ascii="Calibri" w:eastAsia="Times New Roman" w:hAnsi="Calibri" w:cs="Calibri"/>
+                <w:color w:val="1F2937"/>
+                <w:sz w:val="19"/>
+                <w:szCs w:val="19"/>
+              </w:rPr>
+              <w:t>multas(</w:t>
+            </w:r>
+            <w:r>
+              <w:rPr>
+                <w:rFonts w:ascii="Calibri" w:eastAsia="Times New Roman" w:hAnsi="Calibri" w:cs="Calibri"/>
+                <w:color w:val="1F2937"/>
+                <w:sz w:val="19"/>
+                <w:szCs w:val="19"/>
+                <w:u w:val="single"/>
+              </w:rPr>
+              <w:t>id_multa</w:t>
+            </w:r>
+            <w:r>
+              <w:rPr>
+                <w:rFonts w:ascii="Calibri" w:eastAsia="Times New Roman" w:hAnsi="Calibri" w:cs="Calibri"/>
+                <w:color w:val="1F2937"/>
+                <w:sz w:val="19"/>
+                <w:szCs w:val="19"/>
+              </w:rPr>
+              <w:t xml:space="preserve">, id_prestamo, monto, motivo, estado, fecha_generacion, fecha_pago) </w:t>
+            </w:r>
+            <w:r>
+              <w:rPr>
+                <w:rFonts w:ascii="Segoe UI Symbol" w:eastAsia="Times New Roman" w:hAnsi="Segoe UI Symbol" w:cs="Segoe UI Symbol"/>
+                <w:color w:val="1F2937"/>
+                <w:sz w:val="19"/>
+                <w:szCs w:val="19"/>
+              </w:rPr>
+              <w:t>★</w:t>
+            </w:r>
+          </w:p>
+        </w:tc>
+        <w:tc>
+          <w:tcPr>
+            <w:tcW w:w="0" w:type="auto"/>
+            <w:tcBorders>
+              <w:top w:val="single" w:sz="6" w:space="0" w:color="CBD5E1"/>
+              <w:left w:val="single" w:sz="6" w:space="0" w:color="CBD5E1"/>
+              <w:bottom w:val="single" w:sz="6" w:space="0" w:color="CBD5E1"/>
+              <w:right w:val="single" w:sz="6" w:space="0" w:color="CBD5E1"/>
+            </w:tcBorders>
+            <w:tcMar>
+              <w:top w:w="60" w:type="dxa"/>
+              <w:left w:w="100" w:type="dxa"/>
+              <w:bottom w:w="60" w:type="dxa"/>
+              <w:right w:w="100" w:type="dxa"/>
+            </w:tcMar>
+            <w:hideMark/>
+          </w:tcPr>
+          <w:p>
+            <w:pPr>
+              <w:spacing w:before="120" w:after="120"/>
+              <w:rPr>
+                <w:rFonts w:ascii="Calibri" w:eastAsia="Times New Roman" w:hAnsi="Calibri" w:cs="Calibri"/>
+                <w:color w:val="1F2937"/>
+                <w:sz w:val="19"/>
+                <w:szCs w:val="19"/>
+              </w:rPr>
+            </w:pPr>
+            <w:r>
+              <w:rPr>
+                <w:rFonts w:ascii="Calibri" w:eastAsia="Times New Roman" w:hAnsi="Calibri" w:cs="Calibri"/>
+                <w:color w:val="1F2937"/>
+                <w:sz w:val="19"/>
+                <w:szCs w:val="19"/>
+              </w:rPr>
+              <w:t>id_prestamo → prestamos</w:t>
+            </w:r>
+          </w:p>
+        </w:tc>
+        <w:tc>
+          <w:tcPr>
+            <w:tcW w:w="0" w:type="auto"/>
+            <w:tcBorders>
+              <w:top w:val="single" w:sz="6" w:space="0" w:color="CBD5E1"/>
+              <w:left w:val="single" w:sz="6" w:space="0" w:color="CBD5E1"/>
+              <w:bottom w:val="single" w:sz="6" w:space="0" w:color="CBD5E1"/>
+              <w:right w:val="single" w:sz="6" w:space="0" w:color="CBD5E1"/>
+            </w:tcBorders>
+            <w:tcMar>
+              <w:top w:w="60" w:type="dxa"/>
+              <w:left w:w="100" w:type="dxa"/>
+              <w:bottom w:w="60" w:type="dxa"/>
+              <w:right w:w="100" w:type="dxa"/>
+            </w:tcMar>
+            <w:hideMark/>
+          </w:tcPr>
+          <w:p>
+            <w:pPr>
+              <w:spacing w:before="120" w:after="120"/>
+              <w:rPr>
+                <w:rFonts w:ascii="Calibri" w:eastAsia="Times New Roman" w:hAnsi="Calibri" w:cs="Calibri"/>
+                <w:color w:val="1F2937"/>
+                <w:sz w:val="19"/>
+                <w:szCs w:val="19"/>
+              </w:rPr>
+            </w:pPr>
+            <w:r>
+              <w:rPr>
+                <w:rFonts w:ascii="Calibri" w:eastAsia="Times New Roman" w:hAnsi="Calibri" w:cs="Calibri"/>
+                <w:color w:val="1F2937"/>
+                <w:sz w:val="19"/>
+                <w:szCs w:val="19"/>
+              </w:rPr>
+              <w:t>RESTRICT: la multa es evidencia</w:t>
+            </w:r>
+          </w:p>
+        </w:tc>
+      </w:tr>
+    </w:tbl>
+    <w:p>
+      <w:pPr>
+        <w:pStyle w:val="sub"/>
+        <w:rPr>
+          <w:rFonts w:ascii="Calibri" w:hAnsi="Calibri" w:cs="Calibri"/>
+          <w:sz w:val="22"/>
+          <w:szCs w:val="22"/>
+        </w:rPr>
+      </w:pPr>
+      <w:r>
+        <w:rPr>
+          <w:rFonts w:ascii="Calibri" w:hAnsi="Calibri" w:cs="Calibri"/>
+          <w:sz w:val="22"/>
+          <w:szCs w:val="22"/>
+        </w:rPr>
+        <w:t xml:space="preserve">Claves candidatas adicionales (UNIQUE): </w:t>
+      </w:r>
+      <w:r>
+        <w:rPr>
+          <w:rStyle w:val="CdigoHTML"/>
+        </w:rPr>
+        <w:t>socios(codigo_institucional)</w:t>
+      </w:r>
+      <w:r>
+        <w:rPr>
+          <w:rFonts w:ascii="Calibri" w:hAnsi="Calibri" w:cs="Calibri"/>
+          <w:sz w:val="22"/>
+          <w:szCs w:val="22"/>
+        </w:rPr>
+        <w:t xml:space="preserve">, </w:t>
+      </w:r>
+      <w:r>
+        <w:rPr>
+          <w:rStyle w:val="CdigoHTML"/>
+        </w:rPr>
+        <w:t>socios(id_socio, tipo_socio)</w:t>
+      </w:r>
+      <w:r>
+        <w:rPr>
+          <w:rFonts w:ascii="Calibri" w:hAnsi="Calibri" w:cs="Calibri"/>
+          <w:sz w:val="22"/>
+          <w:szCs w:val="22"/>
+        </w:rPr>
+        <w:t xml:space="preserve">, </w:t>
+      </w:r>
+      <w:r>
+        <w:rPr>
+          <w:rStyle w:val="CdigoHTML"/>
+        </w:rPr>
+        <w:t>libro_coautores(id_libro, orden)</w:t>
+      </w:r>
+      <w:r>
+        <w:rPr>
+          <w:rFonts w:ascii="Calibri" w:hAnsi="Calibri" w:cs="Calibri"/>
+          <w:sz w:val="22"/>
+          <w:szCs w:val="22"/>
+        </w:rPr>
+        <w:t xml:space="preserve"> y </w:t>
+      </w:r>
+      <w:r>
+        <w:rPr>
+          <w:rStyle w:val="CdigoHTML"/>
+        </w:rPr>
+        <w:t>multas(id_prestamo, motivo)</w:t>
+      </w:r>
+      <w:r>
+        <w:rPr>
+          <w:rFonts w:ascii="Calibri" w:hAnsi="Calibri" w:cs="Calibri"/>
+          <w:sz w:val="22"/>
+          <w:szCs w:val="22"/>
+        </w:rPr>
+        <w:t>.</w:t>
+      </w:r>
+    </w:p>
+    <w:p>
+      <w:pPr>
         <w:pStyle w:val="Ttulo2"/>
         <w:rPr>
           <w:rFonts w:ascii="Calibri" w:eastAsia="Times New Roman" w:hAnsi="Calibri" w:cs="Calibri"/>
@@ -2073,14 +3995,14 @@
           <w:sz w:val="22"/>
           <w:szCs w:val="22"/>
         </w:rPr>
-        <w:t xml:space="preserve">Se ejecutan en orden con </w:t>
+        <w:t xml:space="preserve">Se ejecutan en orden, de la 001 a la 006, sobre una base vacía; después se carga </w:t>
       </w:r>
       <w:r>
         <w:rPr>
           <w:rStyle w:val="CdigoHTML"/>
           <w:color w:val="1F2937"/>
         </w:rPr>
-        <w:t>ejecutar_todo.ps1</w:t>
+        <w:t>datos/semilla.sql</w:t>
       </w:r>
       <w:r>
         <w:rPr>
@@ -2089,7 +4011,7 @@
           <w:sz w:val="22"/>
           <w:szCs w:val="22"/>
         </w:rPr>
-        <w:t xml:space="preserve">, que borra y crea la base y corre las migraciones y la semilla. </w:t>
+        <w:t xml:space="preserve">. </w:t>
       </w:r>
       <w:r>
         <w:rPr>
@@ -2107,14 +4029,7 @@
           <w:sz w:val="22"/>
           <w:szCs w:val="22"/>
         </w:rPr>
-        <w:t xml:space="preserve"> El script no contiene credenciales: usa las variables </w:t>
-      </w:r>
-      <w:r>
-        <w:rPr>
-          <w:rStyle w:val="CdigoHTML"/>
-          <w:color w:val="1F2937"/>
-        </w:rPr>
-        <w:t>PGHOST/PGPORT/PGUSER</w:t>
+        <w:t xml:space="preserve"> </w:t>
       </w:r>
       <w:r>
         <w:rPr>
@@ -2123,23 +4038,7 @@
           <w:sz w:val="22"/>
           <w:szCs w:val="22"/>
         </w:rPr>
-        <w:t xml:space="preserve"> y el </w:t>
-      </w:r>
-      <w:r>
-        <w:rPr>
-          <w:rStyle w:val="CdigoHTML"/>
-          <w:color w:val="1F2937"/>
-        </w:rPr>
-        <w:t>pgpass.conf</w:t>
-      </w:r>
-      <w:r>
-        <w:rPr>
-          <w:rFonts w:ascii="Calibri" w:hAnsi="Calibri" w:cs="Calibri"/>
-          <w:color w:val="1F2937"/>
-          <w:sz w:val="22"/>
-          <w:szCs w:val="22"/>
-        </w:rPr>
-        <w:t xml:space="preserve"> de cada integrante.</w:t>
+        <w:t>Ningún archivo del repositorio contiene credenciales.</w:t>
       </w:r>
     </w:p>
     <w:p>
@@ -4648,16 +6547,7 @@
           <w:sz w:val="22"/>
           <w:szCs w:val="22"/>
         </w:rPr>
-        <w:t xml:space="preserve"> </w:t>
-      </w:r>
-      <w:r>
-        <w:rPr>
-          <w:rFonts w:ascii="Calibri" w:hAnsi="Calibri" w:cs="Calibri"/>
-          <w:color w:val="1F2937"/>
-          <w:sz w:val="22"/>
-          <w:szCs w:val="22"/>
-        </w:rPr>
-        <w:t xml:space="preserve">(requieren consultar otras filas o tablas): máximo 5 préstamos activos por socio, bloqueo de préstamos a socios con multas pendientes, participación total de la especialización, que un coautor no sea también el autor principal del mismo libro, y sincronizar </w:t>
+        <w:t xml:space="preserve"> (requieren consultar otras filas o tablas): máximo 5 préstamos activos por socio, bloqueo de préstamos a socios con multas pendientes, participación total de la especialización, que un coautor no sea también el autor principal del mismo libro, y sincronizar </w:t>
       </w:r>
       <w:r>
         <w:rPr>
@@ -4673,7 +6563,16 @@
           <w:sz w:val="22"/>
           <w:szCs w:val="22"/>
         </w:rPr>
-        <w:t xml:space="preserve"> con los préstamos. Se implementarán con triggers en la Entrega 3.</w:t>
+        <w:t xml:space="preserve"> </w:t>
+      </w:r>
+      <w:r>
+        <w:rPr>
+          <w:rFonts w:ascii="Calibri" w:hAnsi="Calibri" w:cs="Calibri"/>
+          <w:color w:val="1F2937"/>
+          <w:sz w:val="22"/>
+          <w:szCs w:val="22"/>
+        </w:rPr>
+        <w:t>con los préstamos. Se implementarán con triggers en la Entrega 3.</w:t>
       </w:r>
     </w:p>
     <w:p>
@@ -5855,16 +7754,7 @@
           <w:sz w:val="22"/>
           <w:szCs w:val="22"/>
         </w:rPr>
-        <w:t xml:space="preserve"> </w:t>
-      </w:r>
-      <w:r>
-        <w:rPr>
-          <w:rFonts w:ascii="Calibri" w:hAnsi="Calibri" w:cs="Calibri"/>
-          <w:color w:val="1F2937"/>
-          <w:sz w:val="22"/>
-          <w:szCs w:val="22"/>
-        </w:rPr>
-        <w:t>son exactamente los 6 de los préstamos activos; las multas de atraso valen $1.000 por día de retraso; el único socio con multas pendientes (socio 4) no tiene préstamos posteriores; las reservas solo existen sobre libros sin ejemplares disponibles en esa fecha.</w:t>
+        <w:t xml:space="preserve"> son exactamente los 6 de los préstamos activos; las multas de atraso valen $1.000 por día de retraso; el único socio con multas pendientes (socio 4) no tiene préstamos posteriores; las reservas solo existen sobre libros sin ejemplares disponibles en esa fecha.</w:t>
       </w:r>
     </w:p>
     <w:p>
@@ -25649,9 +27539,9 @@
 <file path=word/numbering.xml><?xml version="1.0" encoding="utf-8"?>
 <w:numbering xmlns:wpc="http://schemas.microsoft.com/office/word/2010/wordprocessingCanvas" xmlns:cx="http://schemas.microsoft.com/office/drawing/2014/chartex" xmlns:cx1="http://schemas.microsoft.com/office/drawing/2015/9/8/chartex" xmlns:cx2="http://schemas.microsoft.com/office/drawing/2015/10/21/chartex" xmlns:cx3="http://schemas.microsoft.com/office/drawing/2016/5/9/chartex" xmlns:cx4="http://schemas.microsoft.com/office/drawing/2016/5/10/chartex" xmlns:cx5="http://schemas.microsoft.com/office/drawing/2016/5/11/chartex" xmlns:cx6="http://schemas.microsoft.com/office/drawing/2016/5/12/chartex" xmlns:cx7="http://schemas.microsoft.com/office/drawing/2016/5/13/chartex" xmlns:cx8="http://schemas.microsoft.com/office/drawing/2016/5/14/chartex" xmlns:mc="http://schemas.openxmlformats.org/markup-compatibility/2006" xmlns:aink="http://schemas.microsoft.com/office/drawing/2016/ink" xmlns:am3d="http://schemas.microsoft.com/office/drawing/2017/model3d" xmlns:o="urn:schemas-microsoft-com:office:office" xmlns:oel="http://schemas.microsoft.com/office/2019/extlst" xmlns:r="http://schemas.openxmlformats.org/officeDocument/2006/relationships" xmlns:m="http://schemas.openxmlformats.org/officeDocument/2006/math" xmlns:v="urn:schemas-microsoft-com:vml" xmlns:wp14="http://schemas.microsoft.com/office/word/2010/wordprocessingDrawing" xmlns:wp="http://schemas.openxmlformats.org/drawingml/2006/wordprocessingDrawing" xmlns:w10="urn:schemas-microsoft-com:office:word" xmlns:w="http://schemas.openxmlformats.org/wordprocessingml/2006/main" xmlns:w14="http://schemas.microsoft.com/office/word/2010/wordml" xmlns:w15="http://schemas.microsoft.com/office/word/2012/wordml" xmlns:w16cex="http://schemas.microsoft.com/office/word/2018/wordml/cex" xmlns:w16cid="http://schemas.microsoft.com/office/word/2016/wordml/cid" xmlns:w16="http://schemas.microsoft.com/office/word/2018/wordml" xmlns:w16du="http://schemas.microsoft.com/office/word/2023/wordml/word16du" xmlns:w16sdtdh="http://schemas.microsoft.com/office/word/2020/wordml/sdtdatahash" xmlns:w16sdtfl="http://schemas.microsoft.com/office/word/2024/wordml/sdtformatlock" xmlns:w16se="http://schemas.microsoft.com/office/word/2015/wordml/symex" xmlns:wpg="http://schemas.microsoft.com/office/word/2010/wordprocessingGroup" xmlns:wpi="http://schemas.microsoft.com/office/word/2010/wordprocessingInk" xmlns:wne="http://schemas.microsoft.com/office/word/2006/wordml" xmlns:wps="http://schemas.microsoft.com/office/word/2010/wordprocessingShape" mc:Ignorable="w14 w15 w16se w16cid w16 w16cex w16sdtdh w16sdtfl w16du wp14">
   <w:abstractNum w:abstractNumId="0" w15:restartNumberingAfterBreak="0">
-    <w:nsid w:val="178803B6"/>
+    <w:nsid w:val="42CD7B0C"/>
     <w:multiLevelType w:val="multilevel"/>
-    <w:tmpl w:val="2DDE2482"/>
+    <w:tmpl w:val="A4444B76"/>
     <w:lvl w:ilvl="0">
       <w:start w:val="1"/>
       <w:numFmt w:val="bullet"/>
@@ -25798,9 +27688,9 @@
     </w:lvl>
   </w:abstractNum>
   <w:abstractNum w:abstractNumId="1" w15:restartNumberingAfterBreak="0">
-    <w:nsid w:val="26054F45"/>
+    <w:nsid w:val="5662470F"/>
     <w:multiLevelType w:val="multilevel"/>
-    <w:tmpl w:val="3FA05F44"/>
+    <w:tmpl w:val="B71C475C"/>
     <w:lvl w:ilvl="0">
       <w:start w:val="1"/>
       <w:numFmt w:val="bullet"/>
@@ -25947,9 +27837,9 @@
     </w:lvl>
   </w:abstractNum>
   <w:abstractNum w:abstractNumId="2" w15:restartNumberingAfterBreak="0">
-    <w:nsid w:val="3F8E6ABD"/>
+    <w:nsid w:val="5F935C47"/>
     <w:multiLevelType w:val="multilevel"/>
-    <w:tmpl w:val="2D38355C"/>
+    <w:tmpl w:val="F5487680"/>
     <w:lvl w:ilvl="0">
       <w:start w:val="1"/>
       <w:numFmt w:val="bullet"/>
@@ -26095,14 +27985,14 @@
       </w:rPr>
     </w:lvl>
   </w:abstractNum>
-  <w:num w:numId="1" w16cid:durableId="292754082">
-    <w:abstractNumId w:val="1"/>
-  </w:num>
-  <w:num w:numId="2" w16cid:durableId="1052003119">
+  <w:num w:numId="1" w16cid:durableId="1157922516">
     <w:abstractNumId w:val="2"/>
   </w:num>
-  <w:num w:numId="3" w16cid:durableId="2045904603">
+  <w:num w:numId="2" w16cid:durableId="981468747">
     <w:abstractNumId w:val="0"/>
+  </w:num>
+  <w:num w:numId="3" w16cid:durableId="58603113">
+    <w:abstractNumId w:val="1"/>
   </w:num>
 </w:numbering>
 </file>

</xml_diff>